<commit_message>
docs: README profissional, Manual de Uso, Guia de Execução Local e Ata
- Reescreve o README.md no formato profissional padrão (banner, sem emojis)
- Move o tutorial do usuário para docs/Manual/Manual de Uso.docx
- Substitui o doc 04 por um Guia de Execução Local (rodar o projeto do GitHub,
  com pré-requisitos por sistema operacional e dependências)
- Adiciona a Ata de Registro de Desenvolvimento (sprints, commits e features)
- Atualiza o link do doc 04 no Hub de Links
- Ignora arquivos temporários do Office (~$*)

Co-Authored-By: Claude Opus 4.8 <noreply@anthropic.com>
</commit_message>
<xml_diff>
--- a/docs/Hub de Links.docx
+++ b/docs/Hub de Links.docx
@@ -707,7 +707,7 @@
               <w:rPr>
                 <w:b/>
               </w:rPr>
-              <w:t>04 · Documento de Implementação Técnica</w:t>
+              <w:t>04 · Guia de Execução Local</w:t>
             </w:r>
           </w:p>
           <w:p>
@@ -719,7 +719,7 @@
                 <w:color w:val="5A5A5A"/>
                 <w:sz w:val="18"/>
               </w:rPr>
-              <w:t>Detalhes de implementação</w:t>
+              <w:t>Como rodar o projeto localmente</w:t>
             </w:r>
           </w:p>
         </w:tc>
@@ -739,7 +739,7 @@
             <w:pPr>
               <w:spacing w:after="0"/>
             </w:pPr>
-            <w:hyperlink r:id="rId15">
+            <w:hyperlink r:id="rId22">
               <w:r>
                 <w:rPr>
                   <w:color w:val="125EA6"/>

</xml_diff>